<commit_message>
make sec03 & update sec02 study(09.05)
</commit_message>
<xml_diff>
--- a/데브옵스를_위한_쿠버네티스_마스터_강의/section02.docx
+++ b/데브옵스를_위한_쿠버네티스_마스터_강의/section02.docx
@@ -6206,11 +6206,6 @@
       </w:r>
     </w:p>
     <w:p>
-      <w:pPr>
-        <w:rPr>
-          <w:rFonts w:hint="eastAsia"/>
-        </w:rPr>
-      </w:pPr>
       <w:r>
         <w:rPr>
           <w:noProof/>
@@ -6350,6 +6345,9 @@
     </w:p>
     <w:p>
       <w:r>
+        <w:rPr>
+          <w:noProof/>
+        </w:rPr>
         <w:drawing>
           <wp:inline distT="0" distB="0" distL="0" distR="0" wp14:anchorId="1BA9E2C1" wp14:editId="1BF5F256">
             <wp:extent cx="5731510" cy="1313815"/>
@@ -6429,6 +6427,9 @@
     </w:p>
     <w:p>
       <w:r>
+        <w:rPr>
+          <w:noProof/>
+        </w:rPr>
         <w:drawing>
           <wp:inline distT="0" distB="0" distL="0" distR="0" wp14:anchorId="4CC8BFEA" wp14:editId="39062EE3">
             <wp:extent cx="5731510" cy="2855595"/>
@@ -6485,6 +6486,9 @@
     </w:p>
     <w:p>
       <w:r>
+        <w:rPr>
+          <w:noProof/>
+        </w:rPr>
         <w:drawing>
           <wp:inline distT="0" distB="0" distL="0" distR="0" wp14:anchorId="11095019" wp14:editId="4B4D25A1">
             <wp:extent cx="5731510" cy="883285"/>
@@ -6559,6 +6563,9 @@
     </w:p>
     <w:p>
       <w:r>
+        <w:rPr>
+          <w:noProof/>
+        </w:rPr>
         <w:lastRenderedPageBreak/>
         <w:drawing>
           <wp:inline distT="0" distB="0" distL="0" distR="0" wp14:anchorId="6D9F5A84" wp14:editId="1C6F19B4">
@@ -6599,6 +6606,9 @@
     </w:p>
     <w:p>
       <w:r>
+        <w:rPr>
+          <w:noProof/>
+        </w:rPr>
         <w:drawing>
           <wp:inline distT="0" distB="0" distL="0" distR="0" wp14:anchorId="1B8D696D" wp14:editId="424406F3">
             <wp:extent cx="5731510" cy="1753235"/>
@@ -6638,6 +6648,9 @@
     </w:p>
     <w:p>
       <w:r>
+        <w:rPr>
+          <w:noProof/>
+        </w:rPr>
         <w:drawing>
           <wp:inline distT="0" distB="0" distL="0" distR="0" wp14:anchorId="66F5D9CE" wp14:editId="230D7529">
             <wp:extent cx="5731510" cy="751840"/>
@@ -6696,6 +6709,9 @@
     </w:p>
     <w:p>
       <w:r>
+        <w:rPr>
+          <w:noProof/>
+        </w:rPr>
         <w:drawing>
           <wp:inline distT="0" distB="0" distL="0" distR="0" wp14:anchorId="558CFF5E" wp14:editId="0FF2EB23">
             <wp:extent cx="5731510" cy="1514475"/>
@@ -6735,6 +6751,141 @@
     </w:p>
     <w:p>
       <w:r>
+        <w:rPr>
+          <w:rFonts w:hint="eastAsia"/>
+        </w:rPr>
+        <w:t xml:space="preserve">인터넷 </w:t>
+      </w:r>
+      <w:proofErr w:type="spellStart"/>
+      <w:r>
+        <w:rPr>
+          <w:rFonts w:hint="eastAsia"/>
+        </w:rPr>
+        <w:t>웹브라우저에</w:t>
+      </w:r>
+      <w:proofErr w:type="spellEnd"/>
+      <w:r>
+        <w:rPr>
+          <w:rFonts w:hint="eastAsia"/>
+        </w:rPr>
+        <w:t xml:space="preserve"> </w:t>
+      </w:r>
+      <w:proofErr w:type="spellStart"/>
+      <w:r>
+        <w:t>wordpress</w:t>
+      </w:r>
+      <w:proofErr w:type="spellEnd"/>
+      <w:r>
+        <w:t xml:space="preserve"> </w:t>
+      </w:r>
+      <w:r>
+        <w:rPr>
+          <w:rFonts w:hint="eastAsia"/>
+        </w:rPr>
+        <w:t>d</w:t>
+      </w:r>
+      <w:r>
+        <w:t>ownload</w:t>
+      </w:r>
+      <w:r>
+        <w:rPr>
+          <w:rFonts w:hint="eastAsia"/>
+        </w:rPr>
+        <w:t xml:space="preserve">를 검색한 후 홈페이지에서 최근 릴리즈의 </w:t>
+      </w:r>
+      <w:r>
+        <w:t>tar.gz</w:t>
+      </w:r>
+      <w:r>
+        <w:rPr>
+          <w:rFonts w:hint="eastAsia"/>
+        </w:rPr>
+        <w:t xml:space="preserve">에 </w:t>
+      </w:r>
+      <w:proofErr w:type="spellStart"/>
+      <w:r>
+        <w:rPr>
+          <w:rFonts w:hint="eastAsia"/>
+        </w:rPr>
+        <w:t>우클릭을</w:t>
+      </w:r>
+      <w:proofErr w:type="spellEnd"/>
+      <w:r>
+        <w:rPr>
+          <w:rFonts w:hint="eastAsia"/>
+        </w:rPr>
+        <w:t xml:space="preserve"> 하여 링크 주소를 복사한다.</w:t>
+      </w:r>
+    </w:p>
+    <w:p>
+      <w:r>
+        <w:lastRenderedPageBreak/>
+        <w:drawing>
+          <wp:inline distT="0" distB="0" distL="0" distR="0" wp14:anchorId="533C6663" wp14:editId="22325145">
+            <wp:extent cx="5731510" cy="4025265"/>
+            <wp:effectExtent l="0" t="0" r="2540" b="0"/>
+            <wp:docPr id="131308448" name="그림 1"/>
+            <wp:cNvGraphicFramePr>
+              <a:graphicFrameLocks xmlns:a="http://schemas.openxmlformats.org/drawingml/2006/main" noChangeAspect="1"/>
+            </wp:cNvGraphicFramePr>
+            <a:graphic xmlns:a="http://schemas.openxmlformats.org/drawingml/2006/main">
+              <a:graphicData uri="http://schemas.openxmlformats.org/drawingml/2006/picture">
+                <pic:pic xmlns:pic="http://schemas.openxmlformats.org/drawingml/2006/picture">
+                  <pic:nvPicPr>
+                    <pic:cNvPr id="131308448" name=""/>
+                    <pic:cNvPicPr/>
+                  </pic:nvPicPr>
+                  <pic:blipFill>
+                    <a:blip r:embed="rId93"/>
+                    <a:stretch>
+                      <a:fillRect/>
+                    </a:stretch>
+                  </pic:blipFill>
+                  <pic:spPr>
+                    <a:xfrm>
+                      <a:off x="0" y="0"/>
+                      <a:ext cx="5731510" cy="4025265"/>
+                    </a:xfrm>
+                    <a:prstGeom prst="rect">
+                      <a:avLst/>
+                    </a:prstGeom>
+                  </pic:spPr>
+                </pic:pic>
+              </a:graphicData>
+            </a:graphic>
+          </wp:inline>
+        </w:drawing>
+      </w:r>
+    </w:p>
+    <w:p>
+      <w:pPr>
+        <w:rPr>
+          <w:rFonts w:hint="eastAsia"/>
+        </w:rPr>
+      </w:pPr>
+      <w:proofErr w:type="spellStart"/>
+      <w:r>
+        <w:rPr>
+          <w:rFonts w:hint="eastAsia"/>
+        </w:rPr>
+        <w:t>w</w:t>
+      </w:r>
+      <w:r>
+        <w:t>get</w:t>
+      </w:r>
+      <w:proofErr w:type="spellEnd"/>
+      <w:r>
+        <w:rPr>
+          <w:rFonts w:hint="eastAsia"/>
+        </w:rPr>
+        <w:t>를 사용하여 다운로드 한다.</w:t>
+      </w:r>
+    </w:p>
+    <w:p>
+      <w:r>
+        <w:rPr>
+          <w:noProof/>
+        </w:rPr>
         <w:drawing>
           <wp:inline distT="0" distB="0" distL="0" distR="0" wp14:anchorId="099A0340" wp14:editId="3D6A23C1">
             <wp:extent cx="5731510" cy="763270"/>
@@ -6751,7 +6902,7 @@
                     <pic:cNvPicPr/>
                   </pic:nvPicPr>
                   <pic:blipFill>
-                    <a:blip r:embed="rId93"/>
+                    <a:blip r:embed="rId94"/>
                     <a:stretch>
                       <a:fillRect/>
                     </a:stretch>
@@ -6773,7 +6924,58 @@
       </w:r>
     </w:p>
     <w:p>
-      <w:r>
+      <w:pPr>
+        <w:rPr>
+          <w:rFonts w:hint="eastAsia"/>
+        </w:rPr>
+      </w:pPr>
+      <w:r>
+        <w:t>tar -</w:t>
+      </w:r>
+      <w:proofErr w:type="spellStart"/>
+      <w:proofErr w:type="gramStart"/>
+      <w:r>
+        <w:t>xf</w:t>
+      </w:r>
+      <w:proofErr w:type="spellEnd"/>
+      <w:r>
+        <w:t xml:space="preserve"> </w:t>
+      </w:r>
+      <w:proofErr w:type="spellStart"/>
+      <w:r>
+        <w:rPr>
+          <w:rFonts w:hint="eastAsia"/>
+        </w:rPr>
+        <w:t>를</w:t>
+      </w:r>
+      <w:proofErr w:type="spellEnd"/>
+      <w:proofErr w:type="gramEnd"/>
+      <w:r>
+        <w:rPr>
+          <w:rFonts w:hint="eastAsia"/>
+        </w:rPr>
+        <w:t xml:space="preserve"> 사용하여 압축을 푼다.</w:t>
+      </w:r>
+      <w:r>
+        <w:t xml:space="preserve"> </w:t>
+      </w:r>
+      <w:proofErr w:type="spellStart"/>
+      <w:r>
+        <w:t>wordpress</w:t>
+      </w:r>
+      <w:proofErr w:type="spellEnd"/>
+      <w:r>
+        <w:rPr>
+          <w:rFonts w:hint="eastAsia"/>
+        </w:rPr>
+        <w:t xml:space="preserve"> 폴더가 생기는 것을 확인할 수 있다.</w:t>
+      </w:r>
+    </w:p>
+    <w:p>
+      <w:r>
+        <w:rPr>
+          <w:noProof/>
+        </w:rPr>
         <w:drawing>
           <wp:inline distT="0" distB="0" distL="0" distR="0" wp14:anchorId="4A35393E" wp14:editId="0E30C950">
             <wp:extent cx="5731510" cy="669925"/>
@@ -6790,7 +6992,7 @@
                     <pic:cNvPicPr/>
                   </pic:nvPicPr>
                   <pic:blipFill>
-                    <a:blip r:embed="rId94"/>
+                    <a:blip r:embed="rId95"/>
                     <a:stretch>
                       <a:fillRect/>
                     </a:stretch>
@@ -6810,6 +7012,534 @@
           </wp:inline>
         </w:drawing>
       </w:r>
+    </w:p>
+    <w:p>
+      <w:r>
+        <w:rPr>
+          <w:rFonts w:hint="eastAsia"/>
+        </w:rPr>
+        <w:t>W</w:t>
+      </w:r>
+      <w:r>
+        <w:t>P</w:t>
+      </w:r>
+      <w:r>
+        <w:rPr>
+          <w:rFonts w:hint="eastAsia"/>
+        </w:rPr>
+        <w:t xml:space="preserve">의 </w:t>
+      </w:r>
+      <w:r>
+        <w:t>bash</w:t>
+      </w:r>
+      <w:r>
+        <w:rPr>
+          <w:rFonts w:hint="eastAsia"/>
+        </w:rPr>
+        <w:t>로 접속한다.</w:t>
+      </w:r>
+    </w:p>
+    <w:p>
+      <w:r>
+        <w:drawing>
+          <wp:inline distT="0" distB="0" distL="0" distR="0" wp14:anchorId="6C44D633" wp14:editId="27DA4D14">
+            <wp:extent cx="4858428" cy="533474"/>
+            <wp:effectExtent l="0" t="0" r="0" b="0"/>
+            <wp:docPr id="1579884778" name="그림 1"/>
+            <wp:cNvGraphicFramePr>
+              <a:graphicFrameLocks xmlns:a="http://schemas.openxmlformats.org/drawingml/2006/main" noChangeAspect="1"/>
+            </wp:cNvGraphicFramePr>
+            <a:graphic xmlns:a="http://schemas.openxmlformats.org/drawingml/2006/main">
+              <a:graphicData uri="http://schemas.openxmlformats.org/drawingml/2006/picture">
+                <pic:pic xmlns:pic="http://schemas.openxmlformats.org/drawingml/2006/picture">
+                  <pic:nvPicPr>
+                    <pic:cNvPr id="1579884778" name=""/>
+                    <pic:cNvPicPr/>
+                  </pic:nvPicPr>
+                  <pic:blipFill>
+                    <a:blip r:embed="rId96"/>
+                    <a:stretch>
+                      <a:fillRect/>
+                    </a:stretch>
+                  </pic:blipFill>
+                  <pic:spPr>
+                    <a:xfrm>
+                      <a:off x="0" y="0"/>
+                      <a:ext cx="4858428" cy="533474"/>
+                    </a:xfrm>
+                    <a:prstGeom prst="rect">
+                      <a:avLst/>
+                    </a:prstGeom>
+                  </pic:spPr>
+                </pic:pic>
+              </a:graphicData>
+            </a:graphic>
+          </wp:inline>
+        </w:drawing>
+      </w:r>
+    </w:p>
+    <w:p>
+      <w:r>
+        <w:rPr>
+          <w:rFonts w:hint="eastAsia"/>
+        </w:rPr>
+        <w:t>소유 권한 변경하기</w:t>
+      </w:r>
+    </w:p>
+    <w:p>
+      <w:r>
+        <w:drawing>
+          <wp:inline distT="0" distB="0" distL="0" distR="0" wp14:anchorId="4487566C" wp14:editId="170B5982">
+            <wp:extent cx="4725059" cy="419158"/>
+            <wp:effectExtent l="0" t="0" r="0" b="0"/>
+            <wp:docPr id="637533884" name="그림 1"/>
+            <wp:cNvGraphicFramePr>
+              <a:graphicFrameLocks xmlns:a="http://schemas.openxmlformats.org/drawingml/2006/main" noChangeAspect="1"/>
+            </wp:cNvGraphicFramePr>
+            <a:graphic xmlns:a="http://schemas.openxmlformats.org/drawingml/2006/main">
+              <a:graphicData uri="http://schemas.openxmlformats.org/drawingml/2006/picture">
+                <pic:pic xmlns:pic="http://schemas.openxmlformats.org/drawingml/2006/picture">
+                  <pic:nvPicPr>
+                    <pic:cNvPr id="637533884" name=""/>
+                    <pic:cNvPicPr/>
+                  </pic:nvPicPr>
+                  <pic:blipFill>
+                    <a:blip r:embed="rId97"/>
+                    <a:stretch>
+                      <a:fillRect/>
+                    </a:stretch>
+                  </pic:blipFill>
+                  <pic:spPr>
+                    <a:xfrm>
+                      <a:off x="0" y="0"/>
+                      <a:ext cx="4725059" cy="419158"/>
+                    </a:xfrm>
+                    <a:prstGeom prst="rect">
+                      <a:avLst/>
+                    </a:prstGeom>
+                  </pic:spPr>
+                </pic:pic>
+              </a:graphicData>
+            </a:graphic>
+          </wp:inline>
+        </w:drawing>
+      </w:r>
+    </w:p>
+    <w:p>
+      <w:r>
+        <w:rPr>
+          <w:rFonts w:hint="eastAsia"/>
+        </w:rPr>
+        <w:t>소유 권한을 준 폴더로 이동한 후 백업 폴더를 생성해두고 기존에 있던 파일들을 전부 옮긴다.</w:t>
+      </w:r>
+    </w:p>
+    <w:p>
+      <w:r>
+        <w:lastRenderedPageBreak/>
+        <w:drawing>
+          <wp:inline distT="0" distB="0" distL="0" distR="0" wp14:anchorId="2470FF63" wp14:editId="55B77D6B">
+            <wp:extent cx="5731510" cy="1292860"/>
+            <wp:effectExtent l="0" t="0" r="2540" b="2540"/>
+            <wp:docPr id="433450328" name="그림 1"/>
+            <wp:cNvGraphicFramePr>
+              <a:graphicFrameLocks xmlns:a="http://schemas.openxmlformats.org/drawingml/2006/main" noChangeAspect="1"/>
+            </wp:cNvGraphicFramePr>
+            <a:graphic xmlns:a="http://schemas.openxmlformats.org/drawingml/2006/main">
+              <a:graphicData uri="http://schemas.openxmlformats.org/drawingml/2006/picture">
+                <pic:pic xmlns:pic="http://schemas.openxmlformats.org/drawingml/2006/picture">
+                  <pic:nvPicPr>
+                    <pic:cNvPr id="433450328" name=""/>
+                    <pic:cNvPicPr/>
+                  </pic:nvPicPr>
+                  <pic:blipFill>
+                    <a:blip r:embed="rId98"/>
+                    <a:stretch>
+                      <a:fillRect/>
+                    </a:stretch>
+                  </pic:blipFill>
+                  <pic:spPr>
+                    <a:xfrm>
+                      <a:off x="0" y="0"/>
+                      <a:ext cx="5731510" cy="1292860"/>
+                    </a:xfrm>
+                    <a:prstGeom prst="rect">
+                      <a:avLst/>
+                    </a:prstGeom>
+                  </pic:spPr>
+                </pic:pic>
+              </a:graphicData>
+            </a:graphic>
+          </wp:inline>
+        </w:drawing>
+      </w:r>
+    </w:p>
+    <w:p>
+      <w:r>
+        <w:rPr>
+          <w:rFonts w:hint="eastAsia"/>
+        </w:rPr>
+        <w:t xml:space="preserve">컨테이너에서 나간 후 </w:t>
+      </w:r>
+      <w:proofErr w:type="spellStart"/>
+      <w:r>
+        <w:t>wordpress</w:t>
+      </w:r>
+      <w:proofErr w:type="spellEnd"/>
+      <w:r>
+        <w:t xml:space="preserve"> </w:t>
+      </w:r>
+      <w:r>
+        <w:rPr>
+          <w:rFonts w:hint="eastAsia"/>
+        </w:rPr>
+        <w:t xml:space="preserve">파일을 </w:t>
+      </w:r>
+      <w:r>
+        <w:t xml:space="preserve">WP </w:t>
+      </w:r>
+      <w:r>
+        <w:rPr>
+          <w:rFonts w:hint="eastAsia"/>
+        </w:rPr>
+        <w:t>컨테이너 안으로 옮겨준다.</w:t>
+      </w:r>
+    </w:p>
+    <w:p>
+      <w:r>
+        <w:drawing>
+          <wp:inline distT="0" distB="0" distL="0" distR="0" wp14:anchorId="3ADC6A73" wp14:editId="26D7DA80">
+            <wp:extent cx="5731510" cy="1189355"/>
+            <wp:effectExtent l="0" t="0" r="2540" b="0"/>
+            <wp:docPr id="416983906" name="그림 1"/>
+            <wp:cNvGraphicFramePr>
+              <a:graphicFrameLocks xmlns:a="http://schemas.openxmlformats.org/drawingml/2006/main" noChangeAspect="1"/>
+            </wp:cNvGraphicFramePr>
+            <a:graphic xmlns:a="http://schemas.openxmlformats.org/drawingml/2006/main">
+              <a:graphicData uri="http://schemas.openxmlformats.org/drawingml/2006/picture">
+                <pic:pic xmlns:pic="http://schemas.openxmlformats.org/drawingml/2006/picture">
+                  <pic:nvPicPr>
+                    <pic:cNvPr id="416983906" name=""/>
+                    <pic:cNvPicPr/>
+                  </pic:nvPicPr>
+                  <pic:blipFill>
+                    <a:blip r:embed="rId99"/>
+                    <a:stretch>
+                      <a:fillRect/>
+                    </a:stretch>
+                  </pic:blipFill>
+                  <pic:spPr>
+                    <a:xfrm>
+                      <a:off x="0" y="0"/>
+                      <a:ext cx="5731510" cy="1189355"/>
+                    </a:xfrm>
+                    <a:prstGeom prst="rect">
+                      <a:avLst/>
+                    </a:prstGeom>
+                  </pic:spPr>
+                </pic:pic>
+              </a:graphicData>
+            </a:graphic>
+          </wp:inline>
+        </w:drawing>
+      </w:r>
+    </w:p>
+    <w:p>
+      <w:proofErr w:type="spellStart"/>
+      <w:r>
+        <w:rPr>
+          <w:rFonts w:hint="eastAsia"/>
+        </w:rPr>
+        <w:t>w</w:t>
+      </w:r>
+      <w:r>
+        <w:t>ordpress</w:t>
+      </w:r>
+      <w:proofErr w:type="spellEnd"/>
+      <w:r>
+        <w:rPr>
+          <w:rFonts w:hint="eastAsia"/>
+        </w:rPr>
+        <w:t>를 그대로 실행하면 문제가 생기기 때문에 폴더 안으로 들어가 존재하던 파일들을 전부 밖으로 가져온다.</w:t>
+      </w:r>
+    </w:p>
+    <w:p>
+      <w:r>
+        <w:drawing>
+          <wp:inline distT="0" distB="0" distL="0" distR="0" wp14:anchorId="3C16BBEC" wp14:editId="30635A2B">
+            <wp:extent cx="5731510" cy="1743075"/>
+            <wp:effectExtent l="0" t="0" r="2540" b="9525"/>
+            <wp:docPr id="707268977" name="그림 1"/>
+            <wp:cNvGraphicFramePr>
+              <a:graphicFrameLocks xmlns:a="http://schemas.openxmlformats.org/drawingml/2006/main" noChangeAspect="1"/>
+            </wp:cNvGraphicFramePr>
+            <a:graphic xmlns:a="http://schemas.openxmlformats.org/drawingml/2006/main">
+              <a:graphicData uri="http://schemas.openxmlformats.org/drawingml/2006/picture">
+                <pic:pic xmlns:pic="http://schemas.openxmlformats.org/drawingml/2006/picture">
+                  <pic:nvPicPr>
+                    <pic:cNvPr id="707268977" name=""/>
+                    <pic:cNvPicPr/>
+                  </pic:nvPicPr>
+                  <pic:blipFill>
+                    <a:blip r:embed="rId100"/>
+                    <a:stretch>
+                      <a:fillRect/>
+                    </a:stretch>
+                  </pic:blipFill>
+                  <pic:spPr>
+                    <a:xfrm>
+                      <a:off x="0" y="0"/>
+                      <a:ext cx="5731510" cy="1743075"/>
+                    </a:xfrm>
+                    <a:prstGeom prst="rect">
+                      <a:avLst/>
+                    </a:prstGeom>
+                  </pic:spPr>
+                </pic:pic>
+              </a:graphicData>
+            </a:graphic>
+          </wp:inline>
+        </w:drawing>
+      </w:r>
+    </w:p>
+    <w:p>
+      <w:r>
+        <w:rPr>
+          <w:rFonts w:hint="eastAsia"/>
+        </w:rPr>
+        <w:t xml:space="preserve">이후 </w:t>
+      </w:r>
+      <w:r>
+        <w:t>127.0.0.1</w:t>
+      </w:r>
+      <w:r>
+        <w:rPr>
+          <w:rFonts w:hint="eastAsia"/>
+        </w:rPr>
+        <w:t>에 접속해본다.</w:t>
+      </w:r>
+    </w:p>
+    <w:p>
+      <w:pPr>
+        <w:rPr>
+          <w:rFonts w:hint="eastAsia"/>
+        </w:rPr>
+      </w:pPr>
+      <w:r>
+        <w:drawing>
+          <wp:inline distT="0" distB="0" distL="0" distR="0" wp14:anchorId="5F9E55A9" wp14:editId="681356DB">
+            <wp:extent cx="4238045" cy="2844927"/>
+            <wp:effectExtent l="0" t="0" r="0" b="0"/>
+            <wp:docPr id="1684380049" name="그림 1"/>
+            <wp:cNvGraphicFramePr>
+              <a:graphicFrameLocks xmlns:a="http://schemas.openxmlformats.org/drawingml/2006/main" noChangeAspect="1"/>
+            </wp:cNvGraphicFramePr>
+            <a:graphic xmlns:a="http://schemas.openxmlformats.org/drawingml/2006/main">
+              <a:graphicData uri="http://schemas.openxmlformats.org/drawingml/2006/picture">
+                <pic:pic xmlns:pic="http://schemas.openxmlformats.org/drawingml/2006/picture">
+                  <pic:nvPicPr>
+                    <pic:cNvPr id="1684380049" name=""/>
+                    <pic:cNvPicPr/>
+                  </pic:nvPicPr>
+                  <pic:blipFill>
+                    <a:blip r:embed="rId101"/>
+                    <a:stretch>
+                      <a:fillRect/>
+                    </a:stretch>
+                  </pic:blipFill>
+                  <pic:spPr>
+                    <a:xfrm>
+                      <a:off x="0" y="0"/>
+                      <a:ext cx="4239007" cy="2845573"/>
+                    </a:xfrm>
+                    <a:prstGeom prst="rect">
+                      <a:avLst/>
+                    </a:prstGeom>
+                  </pic:spPr>
+                </pic:pic>
+              </a:graphicData>
+            </a:graphic>
+          </wp:inline>
+        </w:drawing>
+      </w:r>
+    </w:p>
+    <w:p>
+      <w:r>
+        <w:rPr>
+          <w:rFonts w:hint="eastAsia"/>
+        </w:rPr>
+        <w:lastRenderedPageBreak/>
+        <w:t>d</w:t>
+      </w:r>
+      <w:r>
+        <w:t xml:space="preserve">ocker stop </w:t>
+      </w:r>
+      <w:r>
+        <w:rPr>
+          <w:rFonts w:hint="eastAsia"/>
+        </w:rPr>
+        <w:t xml:space="preserve">명령어를 사용하여 </w:t>
+      </w:r>
+      <w:r>
+        <w:t xml:space="preserve">WP </w:t>
+      </w:r>
+      <w:r>
+        <w:rPr>
+          <w:rFonts w:hint="eastAsia"/>
+        </w:rPr>
+        <w:t xml:space="preserve">컨테이너를 종료 후 다음을 위해 </w:t>
+      </w:r>
+      <w:proofErr w:type="spellStart"/>
+      <w:r>
+        <w:rPr>
+          <w:rFonts w:hint="eastAsia"/>
+        </w:rPr>
+        <w:t>커밋과</w:t>
+      </w:r>
+      <w:proofErr w:type="spellEnd"/>
+      <w:r>
+        <w:rPr>
+          <w:rFonts w:hint="eastAsia"/>
+        </w:rPr>
+        <w:t xml:space="preserve"> </w:t>
+      </w:r>
+      <w:proofErr w:type="spellStart"/>
+      <w:r>
+        <w:rPr>
+          <w:rFonts w:hint="eastAsia"/>
+        </w:rPr>
+        <w:t>푸쉬를</w:t>
+      </w:r>
+      <w:proofErr w:type="spellEnd"/>
+      <w:r>
+        <w:rPr>
+          <w:rFonts w:hint="eastAsia"/>
+        </w:rPr>
+        <w:t xml:space="preserve"> 해본다.</w:t>
+      </w:r>
+    </w:p>
+    <w:p>
+      <w:r>
+        <w:drawing>
+          <wp:inline distT="0" distB="0" distL="0" distR="0" wp14:anchorId="594C2B8E" wp14:editId="02456C5A">
+            <wp:extent cx="5731510" cy="1416050"/>
+            <wp:effectExtent l="0" t="0" r="2540" b="0"/>
+            <wp:docPr id="1003160502" name="그림 1"/>
+            <wp:cNvGraphicFramePr>
+              <a:graphicFrameLocks xmlns:a="http://schemas.openxmlformats.org/drawingml/2006/main" noChangeAspect="1"/>
+            </wp:cNvGraphicFramePr>
+            <a:graphic xmlns:a="http://schemas.openxmlformats.org/drawingml/2006/main">
+              <a:graphicData uri="http://schemas.openxmlformats.org/drawingml/2006/picture">
+                <pic:pic xmlns:pic="http://schemas.openxmlformats.org/drawingml/2006/picture">
+                  <pic:nvPicPr>
+                    <pic:cNvPr id="1003160502" name=""/>
+                    <pic:cNvPicPr/>
+                  </pic:nvPicPr>
+                  <pic:blipFill>
+                    <a:blip r:embed="rId102"/>
+                    <a:stretch>
+                      <a:fillRect/>
+                    </a:stretch>
+                  </pic:blipFill>
+                  <pic:spPr>
+                    <a:xfrm>
+                      <a:off x="0" y="0"/>
+                      <a:ext cx="5731510" cy="1416050"/>
+                    </a:xfrm>
+                    <a:prstGeom prst="rect">
+                      <a:avLst/>
+                    </a:prstGeom>
+                  </pic:spPr>
+                </pic:pic>
+              </a:graphicData>
+            </a:graphic>
+          </wp:inline>
+        </w:drawing>
+      </w:r>
+    </w:p>
+    <w:p>
+      <w:r>
+        <w:drawing>
+          <wp:inline distT="0" distB="0" distL="0" distR="0" wp14:anchorId="6F02B682" wp14:editId="1323BD29">
+            <wp:extent cx="5731510" cy="1753235"/>
+            <wp:effectExtent l="0" t="0" r="2540" b="0"/>
+            <wp:docPr id="723689437" name="그림 1"/>
+            <wp:cNvGraphicFramePr>
+              <a:graphicFrameLocks xmlns:a="http://schemas.openxmlformats.org/drawingml/2006/main" noChangeAspect="1"/>
+            </wp:cNvGraphicFramePr>
+            <a:graphic xmlns:a="http://schemas.openxmlformats.org/drawingml/2006/main">
+              <a:graphicData uri="http://schemas.openxmlformats.org/drawingml/2006/picture">
+                <pic:pic xmlns:pic="http://schemas.openxmlformats.org/drawingml/2006/picture">
+                  <pic:nvPicPr>
+                    <pic:cNvPr id="723689437" name=""/>
+                    <pic:cNvPicPr/>
+                  </pic:nvPicPr>
+                  <pic:blipFill>
+                    <a:blip r:embed="rId103"/>
+                    <a:stretch>
+                      <a:fillRect/>
+                    </a:stretch>
+                  </pic:blipFill>
+                  <pic:spPr>
+                    <a:xfrm>
+                      <a:off x="0" y="0"/>
+                      <a:ext cx="5731510" cy="1753235"/>
+                    </a:xfrm>
+                    <a:prstGeom prst="rect">
+                      <a:avLst/>
+                    </a:prstGeom>
+                  </pic:spPr>
+                </pic:pic>
+              </a:graphicData>
+            </a:graphic>
+          </wp:inline>
+        </w:drawing>
+      </w:r>
+    </w:p>
+    <w:p>
+      <w:r>
+        <w:drawing>
+          <wp:inline distT="0" distB="0" distL="0" distR="0" wp14:anchorId="089B9EAF" wp14:editId="4379BC62">
+            <wp:extent cx="5731510" cy="904875"/>
+            <wp:effectExtent l="0" t="0" r="2540" b="9525"/>
+            <wp:docPr id="796766575" name="그림 1"/>
+            <wp:cNvGraphicFramePr>
+              <a:graphicFrameLocks xmlns:a="http://schemas.openxmlformats.org/drawingml/2006/main" noChangeAspect="1"/>
+            </wp:cNvGraphicFramePr>
+            <a:graphic xmlns:a="http://schemas.openxmlformats.org/drawingml/2006/main">
+              <a:graphicData uri="http://schemas.openxmlformats.org/drawingml/2006/picture">
+                <pic:pic xmlns:pic="http://schemas.openxmlformats.org/drawingml/2006/picture">
+                  <pic:nvPicPr>
+                    <pic:cNvPr id="796766575" name=""/>
+                    <pic:cNvPicPr/>
+                  </pic:nvPicPr>
+                  <pic:blipFill>
+                    <a:blip r:embed="rId104"/>
+                    <a:stretch>
+                      <a:fillRect/>
+                    </a:stretch>
+                  </pic:blipFill>
+                  <pic:spPr>
+                    <a:xfrm>
+                      <a:off x="0" y="0"/>
+                      <a:ext cx="5731510" cy="904875"/>
+                    </a:xfrm>
+                    <a:prstGeom prst="rect">
+                      <a:avLst/>
+                    </a:prstGeom>
+                  </pic:spPr>
+                </pic:pic>
+              </a:graphicData>
+            </a:graphic>
+          </wp:inline>
+        </w:drawing>
+      </w:r>
+    </w:p>
+    <w:p>
+      <w:pPr>
+        <w:rPr>
+          <w:rFonts w:hint="eastAsia"/>
+        </w:rPr>
+      </w:pPr>
     </w:p>
     <w:p>
       <w:pPr>

</xml_diff>